<commit_message>
Intro + Problem Definition
I've added the problem definition
</commit_message>
<xml_diff>
--- a/CA1_1_Ben_Rojas_StrategicThinking.docx
+++ b/CA1_1_Ben_Rojas_StrategicThinking.docx
@@ -20,10 +20,7 @@
         <w:pStyle w:val="Heading1"/>
       </w:pPr>
       <w:r>
-        <w:t xml:space="preserve"> </w:t>
-      </w:r>
-      <w:r>
-        <w:t>Predicting Dow Jones Industrial Average (DJIA) Volatility Using Geopolitical Risk Indicators and Machine Learning</w:t>
+        <w:t xml:space="preserve"> Predicting Dow Jones Industrial Average (DJIA) Volatility Using Geopolitical Risk Indicators and Machine Learning</w:t>
       </w:r>
     </w:p>
     <w:p>
@@ -115,12 +112,74 @@
     </w:p>
     <w:p>
       <w:pPr>
+        <w:rPr>
+          <w:b/>
+          <w:bCs/>
+        </w:rPr>
+      </w:pPr>
+      <w:r>
+        <w:rPr>
+          <w:b/>
+          <w:bCs/>
+        </w:rPr>
+        <w:t xml:space="preserve">Problem Definition </w:t>
+      </w:r>
+      <w:r>
+        <w:rPr>
+          <w:b/>
+          <w:bCs/>
+        </w:rPr>
+        <w:t xml:space="preserve">: </w:t>
+      </w:r>
+    </w:p>
+    <w:p>
+      <w:pPr>
         <w:jc w:val="both"/>
         <w:rPr>
           <w:sz w:val="22"/>
           <w:szCs w:val="22"/>
         </w:rPr>
       </w:pPr>
+      <w:r>
+        <w:rPr>
+          <w:sz w:val="22"/>
+          <w:szCs w:val="22"/>
+        </w:rPr>
+        <w:t>The core problem this project addresses is the limited ability of existing volatility forecasting models to incorporate quantifiable geopolitical risk signals when predicting DJIA volatility. Although geopolitical events are widely recognised as drivers of market uncertainty, their information is rarely integrated directly into traditional forecasting frameworks. Traditional volatility models, including ARCH and GARCH, rely primarily on historical price information and may not fully capture external geopolitical signals.</w:t>
+      </w:r>
+    </w:p>
+    <w:p>
+      <w:pPr>
+        <w:jc w:val="both"/>
+        <w:rPr>
+          <w:sz w:val="22"/>
+          <w:szCs w:val="22"/>
+        </w:rPr>
+      </w:pPr>
+      <w:r>
+        <w:rPr>
+          <w:sz w:val="22"/>
+          <w:szCs w:val="22"/>
+        </w:rPr>
+        <w:t>Failing to address this limitation has direct consequences. Risk managers, portfolio allocators, and financial analysts rely on forecasts that may underestimate volatility during periods of geopolitical tension, leading to suboptimal hedging decisions, inaccurate risk assessments, and unexpected portfolio drawdowns. At the academic level, the gap between quantitative geopolitical research and financial risk modelling remains largely unresolved.</w:t>
+      </w:r>
+    </w:p>
+    <w:p>
+      <w:pPr>
+        <w:jc w:val="both"/>
+        <w:rPr>
+          <w:sz w:val="22"/>
+          <w:szCs w:val="22"/>
+        </w:rPr>
+      </w:pPr>
+      <w:r>
+        <w:rPr>
+          <w:sz w:val="22"/>
+          <w:szCs w:val="22"/>
+        </w:rPr>
+        <w:lastRenderedPageBreak/>
+        <w:t>The specific gap addressed by this project is whether incorporating geopolitical risk indicators into machine learning models improves the prediction of DJIA realised volatility compared with models based solely on historical market data.</w:t>
+      </w:r>
     </w:p>
     <w:p>
       <w:pPr>

</xml_diff>